<commit_message>
Generate documents info update, add build script + main.spec + requirements.txt
</commit_message>
<xml_diff>
--- a/templates/fcl_template.docx
+++ b/templates/fcl_template.docx
@@ -4,335 +4,505 @@
   <w:body>
     <w:p>
       <w:pPr>
-        <w:spacing w:line="240" w:lineRule="auto"/>
-        <w:jc w:val="center"/>
-        <w:rPr>
-          <w:rFonts w:ascii="Times New Roman" w:hAnsi="Times New Roman" w:cs="Times New Roman"/>
-          <w:lang w:val="en-US"/>
-        </w:rPr>
-      </w:pPr>
-      <w:proofErr w:type="spellStart"/>
-      <w:r>
-        <w:rPr>
-          <w:rFonts w:ascii="Times New Roman" w:hAnsi="Times New Roman" w:cs="Times New Roman"/>
-          <w:lang w:val="en-US"/>
-        </w:rPr>
-        <w:t>Modelo</w:t>
-      </w:r>
-      <w:proofErr w:type="spellEnd"/>
-      <w:r>
-        <w:rPr>
-          <w:rFonts w:ascii="Times New Roman" w:hAnsi="Times New Roman" w:cs="Times New Roman"/>
-          <w:lang w:val="en-US"/>
-        </w:rPr>
-        <w:t xml:space="preserve"> para </w:t>
-      </w:r>
-      <w:r>
-        <w:rPr>
-          <w:rFonts w:ascii="Times New Roman" w:hAnsi="Times New Roman" w:cs="Times New Roman"/>
-          <w:lang w:val="en-US"/>
-        </w:rPr>
-        <w:t>F</w:t>
-      </w:r>
-      <w:r>
-        <w:rPr>
-          <w:rFonts w:ascii="Times New Roman" w:hAnsi="Times New Roman" w:cs="Times New Roman"/>
-          <w:lang w:val="en-US"/>
-        </w:rPr>
-        <w:t>CL</w:t>
-      </w:r>
+        <w:jc w:val="right"/>
+        <w:rPr>
+          <w:b/>
+          <w:bCs/>
+          <w:lang w:val="pt-BR"/>
+        </w:rPr>
+      </w:pPr>
     </w:p>
     <w:p>
       <w:pPr>
-        <w:spacing w:line="240" w:lineRule="auto"/>
-        <w:jc w:val="center"/>
-        <w:rPr>
-          <w:rFonts w:ascii="Times New Roman" w:hAnsi="Times New Roman" w:cs="Times New Roman"/>
-          <w:lang w:val="en-US"/>
-        </w:rPr>
-      </w:pPr>
-      <w:proofErr w:type="spellStart"/>
-      <w:r>
-        <w:rPr>
-          <w:rFonts w:ascii="Times New Roman" w:hAnsi="Times New Roman" w:cs="Times New Roman"/>
-          <w:lang w:val="en-US"/>
-        </w:rPr>
-        <w:t>Membrete</w:t>
-      </w:r>
-      <w:proofErr w:type="spellEnd"/>
+        <w:jc w:val="right"/>
+        <w:rPr>
+          <w:b/>
+          <w:bCs/>
+          <w:lang w:val="es-CR"/>
+        </w:rPr>
+      </w:pPr>
+      <w:r>
+        <w:rPr>
+          <w:b/>
+          <w:bCs/>
+          <w:lang w:val="es-CR"/>
+        </w:rPr>
+        <w:t>EW MANUFACTURING S.R.L</w:t>
+      </w:r>
     </w:p>
     <w:p>
       <w:pPr>
-        <w:spacing w:line="240" w:lineRule="auto"/>
-        <w:jc w:val="center"/>
-        <w:rPr>
-          <w:rFonts w:ascii="Times New Roman" w:hAnsi="Times New Roman" w:cs="Times New Roman"/>
-          <w:lang w:val="en-US"/>
-        </w:rPr>
-      </w:pPr>
-      <w:r>
-        <w:rPr>
-          <w:rFonts w:ascii="Times New Roman" w:hAnsi="Times New Roman" w:cs="Times New Roman"/>
-          <w:lang w:val="en-US"/>
-        </w:rPr>
-        <w:t>East West Manufacturing</w:t>
+        <w:jc w:val="right"/>
+        <w:rPr>
+          <w:lang w:val="es-CR"/>
+        </w:rPr>
+      </w:pPr>
+      <w:r>
+        <w:rPr>
+          <w:lang w:val="es-CR"/>
+        </w:rPr>
+        <w:t>Cédula jurídica 3-102-</w:t>
+      </w:r>
+      <w:r>
+        <w:rPr>
+          <w:lang w:val="es-CR"/>
+        </w:rPr>
+        <w:t>597486</w:t>
+      </w:r>
+      <w:r>
+        <w:rPr>
+          <w:lang w:val="es-CR"/>
+        </w:rPr>
+        <w:br/>
+        <w:t>Zona Franca BES</w:t>
+      </w:r>
+      <w:r>
+        <w:rPr>
+          <w:lang w:val="es-CR"/>
+        </w:rPr>
+        <w:br/>
+      </w:r>
+      <w:proofErr w:type="gramStart"/>
+      <w:r>
+        <w:rPr>
+          <w:lang w:val="es-CR"/>
+        </w:rPr>
+        <w:t xml:space="preserve">Alajuela, </w:t>
+      </w:r>
+      <w:r>
+        <w:rPr>
+          <w:lang w:val="es-CR"/>
+        </w:rPr>
+        <w:t xml:space="preserve"> </w:t>
+      </w:r>
+      <w:r>
+        <w:rPr>
+          <w:lang w:val="es-CR"/>
+        </w:rPr>
+        <w:t>{</w:t>
+      </w:r>
+      <w:proofErr w:type="gramEnd"/>
+      <w:r>
+        <w:rPr>
+          <w:lang w:val="es-CR"/>
+        </w:rPr>
+        <w:t>{fecha}}</w:t>
       </w:r>
     </w:p>
     <w:p>
       <w:pPr>
-        <w:spacing w:line="240" w:lineRule="auto"/>
-        <w:rPr>
-          <w:rFonts w:ascii="Times New Roman" w:hAnsi="Times New Roman" w:cs="Times New Roman"/>
-          <w:lang w:val="es-ES"/>
-        </w:rPr>
-      </w:pPr>
-      <w:r>
-        <w:rPr>
-          <w:rFonts w:ascii="Times New Roman" w:hAnsi="Times New Roman" w:cs="Times New Roman"/>
-          <w:lang w:val="es-ES"/>
-        </w:rPr>
-        <w:t>Señores</w:t>
-      </w:r>
+        <w:rPr>
+          <w:b/>
+          <w:bCs/>
+          <w:lang w:val="es-CR"/>
+        </w:rPr>
+      </w:pPr>
     </w:p>
     <w:p>
       <w:pPr>
-        <w:spacing w:line="240" w:lineRule="auto"/>
-        <w:rPr>
-          <w:rFonts w:ascii="Times New Roman" w:hAnsi="Times New Roman" w:cs="Times New Roman"/>
-          <w:lang w:val="es-ES"/>
-        </w:rPr>
-      </w:pPr>
-      <w:r>
-        <w:rPr>
-          <w:rFonts w:ascii="Times New Roman" w:hAnsi="Times New Roman" w:cs="Times New Roman"/>
-          <w:lang w:val="es-ES"/>
-        </w:rPr>
-        <w:t>Por este medio se hace constar que el (la) señor (</w:t>
-      </w:r>
-      <w:proofErr w:type="spellStart"/>
-      <w:r>
-        <w:rPr>
-          <w:rFonts w:ascii="Times New Roman" w:hAnsi="Times New Roman" w:cs="Times New Roman"/>
-          <w:lang w:val="es-ES"/>
-        </w:rPr>
-        <w:t>ra</w:t>
-      </w:r>
-      <w:proofErr w:type="spellEnd"/>
-      <w:r>
-        <w:rPr>
-          <w:rFonts w:ascii="Times New Roman" w:hAnsi="Times New Roman" w:cs="Times New Roman"/>
-          <w:lang w:val="es-ES"/>
-        </w:rPr>
-        <w:t>)</w:t>
-      </w:r>
-      <w:r>
-        <w:rPr>
-          <w:rFonts w:ascii="Times New Roman" w:hAnsi="Times New Roman" w:cs="Times New Roman"/>
-          <w:lang w:val="es-ES"/>
-        </w:rPr>
-        <w:t xml:space="preserve"> </w:t>
-      </w:r>
-      <w:r>
-        <w:rPr>
-          <w:rFonts w:ascii="Times New Roman" w:hAnsi="Times New Roman" w:cs="Times New Roman"/>
-          <w:lang w:val="es-ES"/>
-        </w:rPr>
-        <w:t>{{nombre}}</w:t>
-      </w:r>
-      <w:r>
-        <w:rPr>
-          <w:rFonts w:ascii="Times New Roman" w:hAnsi="Times New Roman" w:cs="Times New Roman"/>
-          <w:lang w:val="es-ES"/>
-        </w:rPr>
-        <w:t xml:space="preserve">, quien se identifica con </w:t>
-      </w:r>
-      <w:r>
-        <w:rPr>
-          <w:rFonts w:ascii="Times New Roman" w:hAnsi="Times New Roman" w:cs="Times New Roman"/>
-          <w:lang w:val="es-ES"/>
-        </w:rPr>
-        <w:t>cédula</w:t>
-      </w:r>
-      <w:r>
-        <w:rPr>
-          <w:rFonts w:ascii="Times New Roman" w:hAnsi="Times New Roman" w:cs="Times New Roman"/>
-          <w:lang w:val="es-ES"/>
-        </w:rPr>
-        <w:t xml:space="preserve"> </w:t>
-      </w:r>
-      <w:r>
-        <w:rPr>
-          <w:rFonts w:ascii="Times New Roman" w:hAnsi="Times New Roman" w:cs="Times New Roman"/>
-          <w:lang w:val="es-ES"/>
-        </w:rPr>
-        <w:t>{{</w:t>
-      </w:r>
-      <w:proofErr w:type="spellStart"/>
-      <w:r>
-        <w:rPr>
-          <w:rFonts w:ascii="Times New Roman" w:hAnsi="Times New Roman" w:cs="Times New Roman"/>
-          <w:lang w:val="es-ES"/>
-        </w:rPr>
-        <w:t>numeroCedula</w:t>
-      </w:r>
-      <w:proofErr w:type="spellEnd"/>
-      <w:r>
-        <w:rPr>
-          <w:rFonts w:ascii="Times New Roman" w:hAnsi="Times New Roman" w:cs="Times New Roman"/>
-          <w:lang w:val="es-ES"/>
-        </w:rPr>
-        <w:t>}}</w:t>
-      </w:r>
-      <w:r>
-        <w:rPr>
-          <w:rFonts w:ascii="Times New Roman" w:hAnsi="Times New Roman" w:cs="Times New Roman"/>
-          <w:lang w:val="es-ES"/>
-        </w:rPr>
-        <w:t>, de profesión u oficio</w:t>
-      </w:r>
-      <w:r>
-        <w:rPr>
-          <w:rFonts w:ascii="Times New Roman" w:hAnsi="Times New Roman" w:cs="Times New Roman"/>
-          <w:lang w:val="es-ES"/>
-        </w:rPr>
-        <w:t xml:space="preserve"> {{departamento}}</w:t>
-      </w:r>
-      <w:r>
-        <w:rPr>
-          <w:rFonts w:ascii="Times New Roman" w:hAnsi="Times New Roman" w:cs="Times New Roman"/>
-          <w:lang w:val="es-ES"/>
-        </w:rPr>
-        <w:t xml:space="preserve">, trabaja en esta Institución desde </w:t>
-      </w:r>
-      <w:r>
-        <w:rPr>
-          <w:rFonts w:ascii="Times New Roman" w:hAnsi="Times New Roman" w:cs="Times New Roman"/>
-          <w:lang w:val="es-ES"/>
-        </w:rPr>
-        <w:t>{{</w:t>
-      </w:r>
-      <w:proofErr w:type="spellStart"/>
-      <w:r>
-        <w:rPr>
-          <w:rFonts w:ascii="Times New Roman" w:hAnsi="Times New Roman" w:cs="Times New Roman"/>
-          <w:lang w:val="es-ES"/>
-        </w:rPr>
-        <w:t>fechaIngreso</w:t>
-      </w:r>
-      <w:proofErr w:type="spellEnd"/>
-      <w:r>
-        <w:rPr>
-          <w:rFonts w:ascii="Times New Roman" w:hAnsi="Times New Roman" w:cs="Times New Roman"/>
-          <w:lang w:val="es-ES"/>
-        </w:rPr>
-        <w:t>}}</w:t>
-      </w:r>
-      <w:r>
-        <w:rPr>
-          <w:rFonts w:ascii="Times New Roman" w:hAnsi="Times New Roman" w:cs="Times New Roman"/>
-          <w:lang w:val="es-ES"/>
-        </w:rPr>
-        <w:t>, ocupando actualmente el puesto de</w:t>
-      </w:r>
-      <w:r>
-        <w:rPr>
-          <w:rFonts w:ascii="Times New Roman" w:hAnsi="Times New Roman" w:cs="Times New Roman"/>
-          <w:lang w:val="es-ES"/>
-        </w:rPr>
-        <w:t xml:space="preserve"> {{puesto}}</w:t>
-      </w:r>
-      <w:r>
-        <w:rPr>
-          <w:rFonts w:ascii="Times New Roman" w:hAnsi="Times New Roman" w:cs="Times New Roman"/>
-          <w:lang w:val="es-ES"/>
-        </w:rPr>
-        <w:t>, devengando un sueldo mensual desglosado de la siguiente manera:</w:t>
-      </w:r>
+        <w:rPr>
+          <w:b/>
+          <w:bCs/>
+          <w:lang w:val="es-CR"/>
+        </w:rPr>
+      </w:pPr>
     </w:p>
     <w:p>
       <w:pPr>
-        <w:spacing w:line="240" w:lineRule="auto"/>
-        <w:rPr>
-          <w:rFonts w:ascii="Times New Roman" w:hAnsi="Times New Roman" w:cs="Times New Roman"/>
-          <w:lang w:val="es-ES"/>
-        </w:rPr>
-      </w:pPr>
-      <w:r>
-        <w:rPr>
-          <w:rFonts w:ascii="Times New Roman" w:hAnsi="Times New Roman" w:cs="Times New Roman"/>
-          <w:lang w:val="es-ES"/>
-        </w:rPr>
-        <w:br/>
-      </w:r>
+        <w:rPr>
+          <w:b/>
+          <w:bCs/>
+          <w:lang w:val="es-CR"/>
+        </w:rPr>
+      </w:pPr>
     </w:p>
     <w:p>
       <w:pPr>
-        <w:spacing w:line="240" w:lineRule="auto"/>
-        <w:rPr>
-          <w:rFonts w:ascii="Times New Roman" w:hAnsi="Times New Roman" w:cs="Times New Roman"/>
-          <w:lang w:val="es-ES"/>
-        </w:rPr>
-      </w:pPr>
-      <w:r>
-        <w:rPr>
-          <w:rFonts w:ascii="Times New Roman" w:hAnsi="Times New Roman" w:cs="Times New Roman"/>
-          <w:lang w:val="es-ES"/>
-        </w:rPr>
-        <w:t>Firma</w:t>
+        <w:rPr>
+          <w:lang w:val="es-CR"/>
+        </w:rPr>
+      </w:pPr>
+      <w:r>
+        <w:rPr>
+          <w:b/>
+          <w:bCs/>
+          <w:lang w:val="es-CR"/>
+        </w:rPr>
+        <w:t xml:space="preserve">A </w:t>
+      </w:r>
+      <w:r>
+        <w:rPr>
+          <w:b/>
+          <w:bCs/>
+          <w:lang w:val="es-CR"/>
+        </w:rPr>
+        <w:t>quien</w:t>
+      </w:r>
+      <w:r>
+        <w:rPr>
+          <w:b/>
+          <w:bCs/>
+          <w:lang w:val="es-CR"/>
+        </w:rPr>
+        <w:t xml:space="preserve"> corresponda,</w:t>
+      </w:r>
+      <w:r>
+        <w:rPr>
+          <w:lang w:val="es-CR"/>
+        </w:rPr>
+        <w:br/>
       </w:r>
     </w:p>
     <w:p>
       <w:pPr>
-        <w:spacing w:line="240" w:lineRule="auto"/>
-        <w:rPr>
-          <w:rFonts w:ascii="Times New Roman" w:hAnsi="Times New Roman" w:cs="Times New Roman"/>
-          <w:lang w:val="es-ES"/>
-        </w:rPr>
-      </w:pPr>
-      <w:r>
-        <w:rPr>
-          <w:rFonts w:ascii="Times New Roman" w:hAnsi="Times New Roman" w:cs="Times New Roman"/>
-          <w:lang w:val="es-ES"/>
-        </w:rPr>
-        <w:t>Nombre y Cargo</w:t>
+        <w:jc w:val="both"/>
+        <w:rPr>
+          <w:lang w:val="es-CR"/>
+        </w:rPr>
+      </w:pPr>
+      <w:r>
+        <w:rPr>
+          <w:lang w:val="es-CR"/>
+        </w:rPr>
+        <w:t xml:space="preserve">Por medio de la presente, </w:t>
+      </w:r>
+      <w:r>
+        <w:rPr>
+          <w:lang w:val="es-CR"/>
+        </w:rPr>
+        <w:t>hago constar</w:t>
+      </w:r>
+      <w:r>
+        <w:rPr>
+          <w:lang w:val="es-CR"/>
+        </w:rPr>
+        <w:t xml:space="preserve"> que, </w:t>
+      </w:r>
+      <w:r>
+        <w:rPr>
+          <w:lang w:val="es-CR"/>
+        </w:rPr>
+        <w:t>el trabajador</w:t>
+      </w:r>
+      <w:r>
+        <w:rPr>
+          <w:lang w:val="es-CR"/>
+        </w:rPr>
+        <w:t xml:space="preserve"> </w:t>
+      </w:r>
+      <w:r>
+        <w:rPr>
+          <w:lang w:val="es-CR"/>
+        </w:rPr>
+        <w:t>{{nombre}}</w:t>
+      </w:r>
+      <w:r>
+        <w:rPr>
+          <w:lang w:val="es-CR"/>
+        </w:rPr>
+        <w:t>, portador del número de cédula</w:t>
+      </w:r>
+      <w:r>
+        <w:rPr>
+          <w:lang w:val="es-CR"/>
+        </w:rPr>
+        <w:t xml:space="preserve"> </w:t>
+      </w:r>
+      <w:r>
+        <w:rPr>
+          <w:lang w:val="es-CR"/>
+        </w:rPr>
+        <w:t>{{</w:t>
+      </w:r>
+      <w:proofErr w:type="spellStart"/>
+      <w:r>
+        <w:rPr>
+          <w:lang w:val="es-CR"/>
+        </w:rPr>
+        <w:t>numeroCedula</w:t>
+      </w:r>
+      <w:proofErr w:type="spellEnd"/>
+      <w:r>
+        <w:rPr>
+          <w:lang w:val="es-CR"/>
+        </w:rPr>
+        <w:t>}}</w:t>
+      </w:r>
+      <w:r>
+        <w:rPr>
+          <w:lang w:val="es-CR"/>
+        </w:rPr>
+        <w:t xml:space="preserve">, </w:t>
+      </w:r>
+      <w:r>
+        <w:rPr>
+          <w:lang w:val="es-CR"/>
+        </w:rPr>
+        <w:t>quién ocup</w:t>
+      </w:r>
+      <w:r>
+        <w:rPr>
+          <w:lang w:val="es-CR"/>
+        </w:rPr>
+        <w:t>a</w:t>
+      </w:r>
+      <w:r>
+        <w:rPr>
+          <w:lang w:val="es-CR"/>
+        </w:rPr>
+        <w:t xml:space="preserve"> el</w:t>
+      </w:r>
+      <w:r>
+        <w:rPr>
+          <w:lang w:val="es-CR"/>
+        </w:rPr>
+        <w:t xml:space="preserve"> puesto</w:t>
+      </w:r>
+      <w:r>
+        <w:rPr>
+          <w:lang w:val="es-CR"/>
+        </w:rPr>
+        <w:t xml:space="preserve"> de</w:t>
+      </w:r>
+      <w:r>
+        <w:rPr>
+          <w:lang w:val="es-CR"/>
+        </w:rPr>
+        <w:t xml:space="preserve"> </w:t>
+      </w:r>
+      <w:r>
+        <w:rPr>
+          <w:lang w:val="es-CR"/>
+        </w:rPr>
+        <w:t>{{puesto}}</w:t>
+      </w:r>
+      <w:r>
+        <w:rPr>
+          <w:lang w:val="es-CR"/>
+        </w:rPr>
+        <w:t>,</w:t>
+      </w:r>
+      <w:r>
+        <w:rPr>
+          <w:lang w:val="es-CR"/>
+        </w:rPr>
+        <w:t xml:space="preserve"> ha trabajado para mi representada desde el </w:t>
+      </w:r>
+      <w:r>
+        <w:rPr>
+          <w:lang w:val="es-CR"/>
+        </w:rPr>
+        <w:t>{{</w:t>
+      </w:r>
+      <w:proofErr w:type="spellStart"/>
+      <w:r>
+        <w:rPr>
+          <w:lang w:val="es-CR"/>
+        </w:rPr>
+        <w:t>fechaIngreso</w:t>
+      </w:r>
+      <w:proofErr w:type="spellEnd"/>
+      <w:r>
+        <w:rPr>
+          <w:lang w:val="es-CR"/>
+        </w:rPr>
+        <w:t>}}</w:t>
+      </w:r>
+      <w:r>
+        <w:rPr>
+          <w:lang w:val="es-CR"/>
+        </w:rPr>
+        <w:t>.</w:t>
+      </w:r>
+      <w:r>
+        <w:rPr>
+          <w:lang w:val="es-CR"/>
+        </w:rPr>
+        <w:t xml:space="preserve"> </w:t>
       </w:r>
     </w:p>
     <w:p>
       <w:pPr>
-        <w:spacing w:line="240" w:lineRule="auto"/>
-        <w:rPr>
-          <w:rFonts w:ascii="Times New Roman" w:hAnsi="Times New Roman" w:cs="Times New Roman"/>
-          <w:lang w:val="es-ES"/>
-        </w:rPr>
-      </w:pPr>
-      <w:r>
-        <w:rPr>
-          <w:rFonts w:ascii="Times New Roman" w:hAnsi="Times New Roman" w:cs="Times New Roman"/>
-          <w:lang w:val="es-ES"/>
-        </w:rPr>
-        <w:t>SELLO</w:t>
+        <w:jc w:val="both"/>
+        <w:rPr>
+          <w:lang w:val="es-CR"/>
+        </w:rPr>
+      </w:pPr>
+      <w:r>
+        <w:rPr>
+          <w:lang w:val="es-CR"/>
+        </w:rPr>
+        <w:t>Brindo</w:t>
+      </w:r>
+      <w:r>
+        <w:rPr>
+          <w:lang w:val="es-CR"/>
+        </w:rPr>
+        <w:t xml:space="preserve"> esta información con el propósito de agilizar el proceso relacionado al Fondo de Capitalización Laboral de</w:t>
+      </w:r>
+      <w:r>
+        <w:rPr>
+          <w:lang w:val="es-CR"/>
+        </w:rPr>
+        <w:t>l</w:t>
+      </w:r>
+      <w:r>
+        <w:rPr>
+          <w:lang w:val="es-CR"/>
+        </w:rPr>
+        <w:t xml:space="preserve"> Sr. </w:t>
+      </w:r>
+      <w:r>
+        <w:rPr>
+          <w:lang w:val="es-CR"/>
+        </w:rPr>
+        <w:t>{{</w:t>
+      </w:r>
+      <w:proofErr w:type="spellStart"/>
+      <w:r>
+        <w:rPr>
+          <w:lang w:val="es-CR"/>
+        </w:rPr>
+        <w:t>primerApellido</w:t>
+      </w:r>
+      <w:proofErr w:type="spellEnd"/>
+      <w:r>
+        <w:rPr>
+          <w:lang w:val="es-CR"/>
+        </w:rPr>
+        <w:t>}}</w:t>
+      </w:r>
+      <w:r>
+        <w:rPr>
+          <w:lang w:val="es-CR"/>
+        </w:rPr>
+        <w:t>.</w:t>
       </w:r>
     </w:p>
     <w:p>
       <w:pPr>
-        <w:spacing w:line="240" w:lineRule="auto"/>
-        <w:rPr>
-          <w:rFonts w:ascii="Times New Roman" w:hAnsi="Times New Roman" w:cs="Times New Roman"/>
-          <w:lang w:val="es-ES"/>
+        <w:jc w:val="both"/>
+        <w:rPr>
+          <w:lang w:val="es-CR"/>
         </w:rPr>
       </w:pPr>
     </w:p>
     <w:p>
       <w:pPr>
-        <w:spacing w:line="240" w:lineRule="auto"/>
-        <w:rPr>
-          <w:rFonts w:ascii="Times New Roman" w:hAnsi="Times New Roman" w:cs="Times New Roman"/>
+        <w:jc w:val="both"/>
+        <w:rPr>
+          <w:lang w:val="es-CR"/>
+        </w:rPr>
+      </w:pPr>
+      <w:r>
+        <w:rPr>
+          <w:lang w:val="es-CR"/>
+        </w:rPr>
+        <w:t>Agradezco de antemano cualquier ayuda que le puedan brindar en sus gestiones</w:t>
+      </w:r>
+      <w:r>
+        <w:rPr>
+          <w:lang w:val="es-CR"/>
+        </w:rPr>
+        <w:t>.</w:t>
+      </w:r>
+    </w:p>
+    <w:p>
+      <w:pPr>
+        <w:rPr>
+          <w:lang w:val="es-CR"/>
+        </w:rPr>
+      </w:pPr>
+    </w:p>
+    <w:p>
+      <w:pPr>
+        <w:rPr>
+          <w:lang w:val="es-CR"/>
+        </w:rPr>
+      </w:pPr>
+    </w:p>
+    <w:p>
+      <w:pPr>
+        <w:rPr>
+          <w:lang w:val="es-CR"/>
+        </w:rPr>
+      </w:pPr>
+    </w:p>
+    <w:p>
+      <w:pPr>
+        <w:rPr>
+          <w:lang w:val="es-CR"/>
+        </w:rPr>
+      </w:pPr>
+      <w:r>
+        <w:rPr>
+          <w:lang w:val="es-CR"/>
+        </w:rPr>
+        <w:t>Atentamente,</w:t>
+      </w:r>
+    </w:p>
+    <w:p>
+      <w:pPr>
+        <w:rPr>
+          <w:lang w:val="es-CR"/>
+        </w:rPr>
+      </w:pPr>
+      <w:r>
+        <w:rPr>
+          <w:b/>
+          <w:bCs/>
+          <w:lang w:val="es-CR"/>
+        </w:rPr>
+        <w:t>Génesis Román Ramírez</w:t>
+      </w:r>
+      <w:r>
+        <w:rPr>
+          <w:lang w:val="es-CR"/>
+        </w:rPr>
+        <w:br/>
+      </w:r>
+      <w:r>
+        <w:rPr>
+          <w:lang w:val="es-CR"/>
+        </w:rPr>
+        <w:t>Ge</w:t>
+      </w:r>
+      <w:r>
+        <w:rPr>
+          <w:lang w:val="es-CR"/>
+        </w:rPr>
+        <w:t xml:space="preserve">neralista de </w:t>
+      </w:r>
+      <w:r>
+        <w:rPr>
+          <w:lang w:val="es-CR"/>
+        </w:rPr>
+        <w:t>Talento Humano</w:t>
+      </w:r>
+      <w:r>
+        <w:rPr>
+          <w:lang w:val="es-CR"/>
+        </w:rPr>
+        <w:br/>
+      </w:r>
+      <w:r>
+        <w:rPr>
+          <w:lang w:val="es-CR"/>
+        </w:rPr>
+        <w:t>EW MANUFACTURING SRL</w:t>
+      </w:r>
+    </w:p>
+    <w:p>
+      <w:pPr>
+        <w:rPr>
+          <w:lang w:val="es-CR"/>
         </w:rPr>
       </w:pPr>
     </w:p>
     <w:sectPr>
+      <w:headerReference w:type="default" r:id="rId7"/>
       <w:pgSz w:w="12240" w:h="15840"/>
-      <w:pgMar w:top="1417" w:right="1701" w:bottom="1417" w:left="1701" w:header="708" w:footer="708" w:gutter="0"/>
+      <w:pgMar w:top="1440" w:right="1440" w:bottom="1440" w:left="1440" w:header="708" w:footer="708" w:gutter="0"/>
       <w:cols w:space="708"/>
       <w:docGrid w:linePitch="360"/>
     </w:sectPr>
@@ -340,16 +510,448 @@
 </w:document>
 </file>
 
+<file path=word/endnotes.xml><?xml version="1.0" encoding="utf-8"?>
+<w:endnotes xmlns:wpc="http://schemas.microsoft.com/office/word/2010/wordprocessingCanvas" xmlns:cx="http://schemas.microsoft.com/office/drawing/2014/chartex" xmlns:cx1="http://schemas.microsoft.com/office/drawing/2015/9/8/chartex" xmlns:cx2="http://schemas.microsoft.com/office/drawing/2015/10/21/chartex" xmlns:cx3="http://schemas.microsoft.com/office/drawing/2016/5/9/chartex" xmlns:cx4="http://schemas.microsoft.com/office/drawing/2016/5/10/chartex" xmlns:cx5="http://schemas.microsoft.com/office/drawing/2016/5/11/chartex" xmlns:cx6="http://schemas.microsoft.com/office/drawing/2016/5/12/chartex" xmlns:cx7="http://schemas.microsoft.com/office/drawing/2016/5/13/chartex" xmlns:cx8="http://schemas.microsoft.com/office/drawing/2016/5/14/chartex" xmlns:mc="http://schemas.openxmlformats.org/markup-compatibility/2006" xmlns:aink="http://schemas.microsoft.com/office/drawing/2016/ink" xmlns:am3d="http://schemas.microsoft.com/office/drawing/2017/model3d" xmlns:o="urn:schemas-microsoft-com:office:office" xmlns:oel="http://schemas.microsoft.com/office/2019/extlst" xmlns:r="http://schemas.openxmlformats.org/officeDocument/2006/relationships" xmlns:m="http://schemas.openxmlformats.org/officeDocument/2006/math" xmlns:v="urn:schemas-microsoft-com:vml" xmlns:wp14="http://schemas.microsoft.com/office/word/2010/wordprocessingDrawing" xmlns:wp="http://schemas.openxmlformats.org/drawingml/2006/wordprocessingDrawing" xmlns:w10="urn:schemas-microsoft-com:office:word" xmlns:w="http://schemas.openxmlformats.org/wordprocessingml/2006/main" xmlns:w14="http://schemas.microsoft.com/office/word/2010/wordml" xmlns:w15="http://schemas.microsoft.com/office/word/2012/wordml" xmlns:w16cex="http://schemas.microsoft.com/office/word/2018/wordml/cex" xmlns:w16cid="http://schemas.microsoft.com/office/word/2016/wordml/cid" xmlns:w16="http://schemas.microsoft.com/office/word/2018/wordml" xmlns:w16du="http://schemas.microsoft.com/office/word/2023/wordml/word16du" xmlns:w16sdtdh="http://schemas.microsoft.com/office/word/2020/wordml/sdtdatahash" xmlns:w16sdtfl="http://schemas.microsoft.com/office/word/2024/wordml/sdtformatlock" xmlns:w16se="http://schemas.microsoft.com/office/word/2015/wordml/symex" xmlns:wpg="http://schemas.microsoft.com/office/word/2010/wordprocessingGroup" xmlns:wpi="http://schemas.microsoft.com/office/word/2010/wordprocessingInk" xmlns:wne="http://schemas.microsoft.com/office/word/2006/wordml" xmlns:wps="http://schemas.microsoft.com/office/word/2010/wordprocessingShape" mc:Ignorable="w14 w15 w16se w16cid w16 w16cex w16sdtdh w16sdtfl w16du wp14">
+  <w:endnote w:type="separator" w:id="-1">
+    <w:p>
+      <w:pPr>
+        <w:spacing w:after="0" w:line="240" w:lineRule="auto"/>
+      </w:pPr>
+      <w:r>
+        <w:separator/>
+      </w:r>
+    </w:p>
+  </w:endnote>
+  <w:endnote w:type="continuationSeparator" w:id="0">
+    <w:p>
+      <w:pPr>
+        <w:spacing w:after="0" w:line="240" w:lineRule="auto"/>
+      </w:pPr>
+      <w:r>
+        <w:continuationSeparator/>
+      </w:r>
+    </w:p>
+  </w:endnote>
+</w:endnotes>
+</file>
+
+<file path=word/footnotes.xml><?xml version="1.0" encoding="utf-8"?>
+<w:footnotes xmlns:wpc="http://schemas.microsoft.com/office/word/2010/wordprocessingCanvas" xmlns:cx="http://schemas.microsoft.com/office/drawing/2014/chartex" xmlns:cx1="http://schemas.microsoft.com/office/drawing/2015/9/8/chartex" xmlns:cx2="http://schemas.microsoft.com/office/drawing/2015/10/21/chartex" xmlns:cx3="http://schemas.microsoft.com/office/drawing/2016/5/9/chartex" xmlns:cx4="http://schemas.microsoft.com/office/drawing/2016/5/10/chartex" xmlns:cx5="http://schemas.microsoft.com/office/drawing/2016/5/11/chartex" xmlns:cx6="http://schemas.microsoft.com/office/drawing/2016/5/12/chartex" xmlns:cx7="http://schemas.microsoft.com/office/drawing/2016/5/13/chartex" xmlns:cx8="http://schemas.microsoft.com/office/drawing/2016/5/14/chartex" xmlns:mc="http://schemas.openxmlformats.org/markup-compatibility/2006" xmlns:aink="http://schemas.microsoft.com/office/drawing/2016/ink" xmlns:am3d="http://schemas.microsoft.com/office/drawing/2017/model3d" xmlns:o="urn:schemas-microsoft-com:office:office" xmlns:oel="http://schemas.microsoft.com/office/2019/extlst" xmlns:r="http://schemas.openxmlformats.org/officeDocument/2006/relationships" xmlns:m="http://schemas.openxmlformats.org/officeDocument/2006/math" xmlns:v="urn:schemas-microsoft-com:vml" xmlns:wp14="http://schemas.microsoft.com/office/word/2010/wordprocessingDrawing" xmlns:wp="http://schemas.openxmlformats.org/drawingml/2006/wordprocessingDrawing" xmlns:w10="urn:schemas-microsoft-com:office:word" xmlns:w="http://schemas.openxmlformats.org/wordprocessingml/2006/main" xmlns:w14="http://schemas.microsoft.com/office/word/2010/wordml" xmlns:w15="http://schemas.microsoft.com/office/word/2012/wordml" xmlns:w16cex="http://schemas.microsoft.com/office/word/2018/wordml/cex" xmlns:w16cid="http://schemas.microsoft.com/office/word/2016/wordml/cid" xmlns:w16="http://schemas.microsoft.com/office/word/2018/wordml" xmlns:w16du="http://schemas.microsoft.com/office/word/2023/wordml/word16du" xmlns:w16sdtdh="http://schemas.microsoft.com/office/word/2020/wordml/sdtdatahash" xmlns:w16sdtfl="http://schemas.microsoft.com/office/word/2024/wordml/sdtformatlock" xmlns:w16se="http://schemas.microsoft.com/office/word/2015/wordml/symex" xmlns:wpg="http://schemas.microsoft.com/office/word/2010/wordprocessingGroup" xmlns:wpi="http://schemas.microsoft.com/office/word/2010/wordprocessingInk" xmlns:wne="http://schemas.microsoft.com/office/word/2006/wordml" xmlns:wps="http://schemas.microsoft.com/office/word/2010/wordprocessingShape" mc:Ignorable="w14 w15 w16se w16cid w16 w16cex w16sdtdh w16sdtfl w16du wp14">
+  <w:footnote w:type="separator" w:id="-1">
+    <w:p>
+      <w:pPr>
+        <w:spacing w:after="0" w:line="240" w:lineRule="auto"/>
+      </w:pPr>
+      <w:r>
+        <w:separator/>
+      </w:r>
+    </w:p>
+  </w:footnote>
+  <w:footnote w:type="continuationSeparator" w:id="0">
+    <w:p>
+      <w:pPr>
+        <w:spacing w:after="0" w:line="240" w:lineRule="auto"/>
+      </w:pPr>
+      <w:r>
+        <w:continuationSeparator/>
+      </w:r>
+    </w:p>
+  </w:footnote>
+</w:footnotes>
+</file>
+
+<file path=word/header1.xml><?xml version="1.0" encoding="utf-8"?>
+<w:hdr xmlns:wpc="http://schemas.microsoft.com/office/word/2010/wordprocessingCanvas" xmlns:cx="http://schemas.microsoft.com/office/drawing/2014/chartex" xmlns:cx1="http://schemas.microsoft.com/office/drawing/2015/9/8/chartex" xmlns:cx2="http://schemas.microsoft.com/office/drawing/2015/10/21/chartex" xmlns:cx3="http://schemas.microsoft.com/office/drawing/2016/5/9/chartex" xmlns:cx4="http://schemas.microsoft.com/office/drawing/2016/5/10/chartex" xmlns:cx5="http://schemas.microsoft.com/office/drawing/2016/5/11/chartex" xmlns:cx6="http://schemas.microsoft.com/office/drawing/2016/5/12/chartex" xmlns:cx7="http://schemas.microsoft.com/office/drawing/2016/5/13/chartex" xmlns:cx8="http://schemas.microsoft.com/office/drawing/2016/5/14/chartex" xmlns:mc="http://schemas.openxmlformats.org/markup-compatibility/2006" xmlns:aink="http://schemas.microsoft.com/office/drawing/2016/ink" xmlns:am3d="http://schemas.microsoft.com/office/drawing/2017/model3d" xmlns:o="urn:schemas-microsoft-com:office:office" xmlns:oel="http://schemas.microsoft.com/office/2019/extlst" xmlns:r="http://schemas.openxmlformats.org/officeDocument/2006/relationships" xmlns:m="http://schemas.openxmlformats.org/officeDocument/2006/math" xmlns:v="urn:schemas-microsoft-com:vml" xmlns:wp14="http://schemas.microsoft.com/office/word/2010/wordprocessingDrawing" xmlns:wp="http://schemas.openxmlformats.org/drawingml/2006/wordprocessingDrawing" xmlns:w10="urn:schemas-microsoft-com:office:word" xmlns:w="http://schemas.openxmlformats.org/wordprocessingml/2006/main" xmlns:w14="http://schemas.microsoft.com/office/word/2010/wordml" xmlns:w15="http://schemas.microsoft.com/office/word/2012/wordml" xmlns:w16cex="http://schemas.microsoft.com/office/word/2018/wordml/cex" xmlns:w16cid="http://schemas.microsoft.com/office/word/2016/wordml/cid" xmlns:w16="http://schemas.microsoft.com/office/word/2018/wordml" xmlns:w16du="http://schemas.microsoft.com/office/word/2023/wordml/word16du" xmlns:w16sdtdh="http://schemas.microsoft.com/office/word/2020/wordml/sdtdatahash" xmlns:w16sdtfl="http://schemas.microsoft.com/office/word/2024/wordml/sdtformatlock" xmlns:w16se="http://schemas.microsoft.com/office/word/2015/wordml/symex" xmlns:wpg="http://schemas.microsoft.com/office/word/2010/wordprocessingGroup" xmlns:wpi="http://schemas.microsoft.com/office/word/2010/wordprocessingInk" xmlns:wne="http://schemas.microsoft.com/office/word/2006/wordml" xmlns:wps="http://schemas.microsoft.com/office/word/2010/wordprocessingShape" mc:Ignorable="w14 w15 w16se w16cid w16 w16cex w16sdtdh w16sdtfl w16du wp14">
+  <w:p>
+    <w:pPr>
+      <w:pStyle w:val="Encabezado"/>
+      <w:jc w:val="center"/>
+    </w:pPr>
+    <w:r>
+      <w:rPr>
+        <w:noProof/>
+        <w:lang w:eastAsia="es-MX"/>
+      </w:rPr>
+      <w:drawing>
+        <wp:inline distT="0" distB="0" distL="0" distR="0" wp14:anchorId="369834CB" wp14:editId="30BF445F">
+          <wp:extent cx="2924175" cy="942975"/>
+          <wp:effectExtent l="0" t="0" r="9525" b="9525"/>
+          <wp:docPr id="4" name="Imagen 3" descr="Logotipo&#10;&#10;Descripción generada automáticamente">
+            <a:extLst xmlns:a="http://schemas.openxmlformats.org/drawingml/2006/main">
+              <a:ext uri="{FF2B5EF4-FFF2-40B4-BE49-F238E27FC236}">
+                <a16:creationId xmlns:a16="http://schemas.microsoft.com/office/drawing/2014/main" id="{9DD40B7B-DBBA-4A66-A679-D99BCF339463}"/>
+              </a:ext>
+            </a:extLst>
+          </wp:docPr>
+          <wp:cNvGraphicFramePr/>
+          <a:graphic xmlns:a="http://schemas.openxmlformats.org/drawingml/2006/main">
+            <a:graphicData uri="http://schemas.openxmlformats.org/drawingml/2006/picture">
+              <pic:pic xmlns:pic="http://schemas.openxmlformats.org/drawingml/2006/picture">
+                <pic:nvPicPr>
+                  <pic:cNvPr id="4" name="Imagen 3" descr="Logotipo&#10;&#10;Descripción generada automáticamente">
+                    <a:extLst>
+                      <a:ext uri="{FF2B5EF4-FFF2-40B4-BE49-F238E27FC236}">
+                        <a16:creationId xmlns:a16="http://schemas.microsoft.com/office/drawing/2014/main" id="{9DD40B7B-DBBA-4A66-A679-D99BCF339463}"/>
+                      </a:ext>
+                    </a:extLst>
+                  </pic:cNvPr>
+                  <pic:cNvPicPr/>
+                </pic:nvPicPr>
+                <pic:blipFill>
+                  <a:blip r:embed="rId1">
+                    <a:extLst>
+                      <a:ext uri="{28A0092B-C50C-407E-A947-70E740481C1C}">
+                        <a14:useLocalDpi xmlns:a14="http://schemas.microsoft.com/office/drawing/2010/main" val="0"/>
+                      </a:ext>
+                    </a:extLst>
+                  </a:blip>
+                  <a:srcRect/>
+                  <a:stretch>
+                    <a:fillRect/>
+                  </a:stretch>
+                </pic:blipFill>
+                <pic:spPr bwMode="auto">
+                  <a:xfrm>
+                    <a:off x="0" y="0"/>
+                    <a:ext cx="2924175" cy="942975"/>
+                  </a:xfrm>
+                  <a:prstGeom prst="rect">
+                    <a:avLst/>
+                  </a:prstGeom>
+                  <a:noFill/>
+                  <a:ln>
+                    <a:noFill/>
+                  </a:ln>
+                </pic:spPr>
+              </pic:pic>
+            </a:graphicData>
+          </a:graphic>
+        </wp:inline>
+      </w:drawing>
+    </w:r>
+  </w:p>
+</w:hdr>
+</file>
+
+<file path=word/numbering.xml><?xml version="1.0" encoding="utf-8"?>
+<w:numbering xmlns:wpc="http://schemas.microsoft.com/office/word/2010/wordprocessingCanvas" xmlns:cx="http://schemas.microsoft.com/office/drawing/2014/chartex" xmlns:cx1="http://schemas.microsoft.com/office/drawing/2015/9/8/chartex" xmlns:cx2="http://schemas.microsoft.com/office/drawing/2015/10/21/chartex" xmlns:cx3="http://schemas.microsoft.com/office/drawing/2016/5/9/chartex" xmlns:cx4="http://schemas.microsoft.com/office/drawing/2016/5/10/chartex" xmlns:cx5="http://schemas.microsoft.com/office/drawing/2016/5/11/chartex" xmlns:cx6="http://schemas.microsoft.com/office/drawing/2016/5/12/chartex" xmlns:cx7="http://schemas.microsoft.com/office/drawing/2016/5/13/chartex" xmlns:cx8="http://schemas.microsoft.com/office/drawing/2016/5/14/chartex" xmlns:mc="http://schemas.openxmlformats.org/markup-compatibility/2006" xmlns:aink="http://schemas.microsoft.com/office/drawing/2016/ink" xmlns:am3d="http://schemas.microsoft.com/office/drawing/2017/model3d" xmlns:o="urn:schemas-microsoft-com:office:office" xmlns:oel="http://schemas.microsoft.com/office/2019/extlst" xmlns:r="http://schemas.openxmlformats.org/officeDocument/2006/relationships" xmlns:m="http://schemas.openxmlformats.org/officeDocument/2006/math" xmlns:v="urn:schemas-microsoft-com:vml" xmlns:wp14="http://schemas.microsoft.com/office/word/2010/wordprocessingDrawing" xmlns:wp="http://schemas.openxmlformats.org/drawingml/2006/wordprocessingDrawing" xmlns:w10="urn:schemas-microsoft-com:office:word" xmlns:w="http://schemas.openxmlformats.org/wordprocessingml/2006/main" xmlns:w14="http://schemas.microsoft.com/office/word/2010/wordml" xmlns:w15="http://schemas.microsoft.com/office/word/2012/wordml" xmlns:w16cex="http://schemas.microsoft.com/office/word/2018/wordml/cex" xmlns:w16cid="http://schemas.microsoft.com/office/word/2016/wordml/cid" xmlns:w16="http://schemas.microsoft.com/office/word/2018/wordml" xmlns:w16du="http://schemas.microsoft.com/office/word/2023/wordml/word16du" xmlns:w16sdtdh="http://schemas.microsoft.com/office/word/2020/wordml/sdtdatahash" xmlns:w16sdtfl="http://schemas.microsoft.com/office/word/2024/wordml/sdtformatlock" xmlns:w16se="http://schemas.microsoft.com/office/word/2015/wordml/symex" xmlns:wpg="http://schemas.microsoft.com/office/word/2010/wordprocessingGroup" xmlns:wpi="http://schemas.microsoft.com/office/word/2010/wordprocessingInk" xmlns:wne="http://schemas.microsoft.com/office/word/2006/wordml" xmlns:wps="http://schemas.microsoft.com/office/word/2010/wordprocessingShape" mc:Ignorable="w14 w15 w16se w16cid w16 w16cex w16sdtdh w16sdtfl w16du wp14">
+  <w:abstractNum w:abstractNumId="0" w15:restartNumberingAfterBreak="0">
+    <w:nsid w:val="0D774DF9"/>
+    <w:multiLevelType w:val="multilevel"/>
+    <w:tmpl w:val="F92496E6"/>
+    <w:lvl w:ilvl="0">
+      <w:start w:val="1"/>
+      <w:numFmt w:val="bullet"/>
+      <w:lvlText w:val=""/>
+      <w:lvlJc w:val="left"/>
+      <w:pPr>
+        <w:tabs>
+          <w:tab w:val="num" w:pos="720"/>
+        </w:tabs>
+        <w:ind w:left="720" w:hanging="360"/>
+      </w:pPr>
+      <w:rPr>
+        <w:rFonts w:ascii="Symbol" w:hAnsi="Symbol" w:hint="default"/>
+        <w:sz w:val="20"/>
+      </w:rPr>
+    </w:lvl>
+    <w:lvl w:ilvl="1" w:tentative="1">
+      <w:start w:val="1"/>
+      <w:numFmt w:val="bullet"/>
+      <w:lvlText w:val="o"/>
+      <w:lvlJc w:val="left"/>
+      <w:pPr>
+        <w:tabs>
+          <w:tab w:val="num" w:pos="1440"/>
+        </w:tabs>
+        <w:ind w:left="1440" w:hanging="360"/>
+      </w:pPr>
+      <w:rPr>
+        <w:rFonts w:ascii="Courier New" w:hAnsi="Courier New" w:hint="default"/>
+        <w:sz w:val="20"/>
+      </w:rPr>
+    </w:lvl>
+    <w:lvl w:ilvl="2" w:tentative="1">
+      <w:start w:val="1"/>
+      <w:numFmt w:val="bullet"/>
+      <w:lvlText w:val=""/>
+      <w:lvlJc w:val="left"/>
+      <w:pPr>
+        <w:tabs>
+          <w:tab w:val="num" w:pos="2160"/>
+        </w:tabs>
+        <w:ind w:left="2160" w:hanging="360"/>
+      </w:pPr>
+      <w:rPr>
+        <w:rFonts w:ascii="Wingdings" w:hAnsi="Wingdings" w:hint="default"/>
+        <w:sz w:val="20"/>
+      </w:rPr>
+    </w:lvl>
+    <w:lvl w:ilvl="3" w:tentative="1">
+      <w:start w:val="1"/>
+      <w:numFmt w:val="bullet"/>
+      <w:lvlText w:val=""/>
+      <w:lvlJc w:val="left"/>
+      <w:pPr>
+        <w:tabs>
+          <w:tab w:val="num" w:pos="2880"/>
+        </w:tabs>
+        <w:ind w:left="2880" w:hanging="360"/>
+      </w:pPr>
+      <w:rPr>
+        <w:rFonts w:ascii="Wingdings" w:hAnsi="Wingdings" w:hint="default"/>
+        <w:sz w:val="20"/>
+      </w:rPr>
+    </w:lvl>
+    <w:lvl w:ilvl="4" w:tentative="1">
+      <w:start w:val="1"/>
+      <w:numFmt w:val="bullet"/>
+      <w:lvlText w:val=""/>
+      <w:lvlJc w:val="left"/>
+      <w:pPr>
+        <w:tabs>
+          <w:tab w:val="num" w:pos="3600"/>
+        </w:tabs>
+        <w:ind w:left="3600" w:hanging="360"/>
+      </w:pPr>
+      <w:rPr>
+        <w:rFonts w:ascii="Wingdings" w:hAnsi="Wingdings" w:hint="default"/>
+        <w:sz w:val="20"/>
+      </w:rPr>
+    </w:lvl>
+    <w:lvl w:ilvl="5" w:tentative="1">
+      <w:start w:val="1"/>
+      <w:numFmt w:val="bullet"/>
+      <w:lvlText w:val=""/>
+      <w:lvlJc w:val="left"/>
+      <w:pPr>
+        <w:tabs>
+          <w:tab w:val="num" w:pos="4320"/>
+        </w:tabs>
+        <w:ind w:left="4320" w:hanging="360"/>
+      </w:pPr>
+      <w:rPr>
+        <w:rFonts w:ascii="Wingdings" w:hAnsi="Wingdings" w:hint="default"/>
+        <w:sz w:val="20"/>
+      </w:rPr>
+    </w:lvl>
+    <w:lvl w:ilvl="6" w:tentative="1">
+      <w:start w:val="1"/>
+      <w:numFmt w:val="bullet"/>
+      <w:lvlText w:val=""/>
+      <w:lvlJc w:val="left"/>
+      <w:pPr>
+        <w:tabs>
+          <w:tab w:val="num" w:pos="5040"/>
+        </w:tabs>
+        <w:ind w:left="5040" w:hanging="360"/>
+      </w:pPr>
+      <w:rPr>
+        <w:rFonts w:ascii="Wingdings" w:hAnsi="Wingdings" w:hint="default"/>
+        <w:sz w:val="20"/>
+      </w:rPr>
+    </w:lvl>
+    <w:lvl w:ilvl="7" w:tentative="1">
+      <w:start w:val="1"/>
+      <w:numFmt w:val="bullet"/>
+      <w:lvlText w:val=""/>
+      <w:lvlJc w:val="left"/>
+      <w:pPr>
+        <w:tabs>
+          <w:tab w:val="num" w:pos="5760"/>
+        </w:tabs>
+        <w:ind w:left="5760" w:hanging="360"/>
+      </w:pPr>
+      <w:rPr>
+        <w:rFonts w:ascii="Wingdings" w:hAnsi="Wingdings" w:hint="default"/>
+        <w:sz w:val="20"/>
+      </w:rPr>
+    </w:lvl>
+    <w:lvl w:ilvl="8" w:tentative="1">
+      <w:start w:val="1"/>
+      <w:numFmt w:val="bullet"/>
+      <w:lvlText w:val=""/>
+      <w:lvlJc w:val="left"/>
+      <w:pPr>
+        <w:tabs>
+          <w:tab w:val="num" w:pos="6480"/>
+        </w:tabs>
+        <w:ind w:left="6480" w:hanging="360"/>
+      </w:pPr>
+      <w:rPr>
+        <w:rFonts w:ascii="Wingdings" w:hAnsi="Wingdings" w:hint="default"/>
+        <w:sz w:val="20"/>
+      </w:rPr>
+    </w:lvl>
+  </w:abstractNum>
+  <w:abstractNum w:abstractNumId="1" w15:restartNumberingAfterBreak="0">
+    <w:nsid w:val="24271A2D"/>
+    <w:multiLevelType w:val="multilevel"/>
+    <w:tmpl w:val="A9D6FDB6"/>
+    <w:lvl w:ilvl="0">
+      <w:start w:val="1"/>
+      <w:numFmt w:val="bullet"/>
+      <w:lvlText w:val=""/>
+      <w:lvlJc w:val="left"/>
+      <w:pPr>
+        <w:tabs>
+          <w:tab w:val="num" w:pos="720"/>
+        </w:tabs>
+        <w:ind w:left="720" w:hanging="360"/>
+      </w:pPr>
+      <w:rPr>
+        <w:rFonts w:ascii="Symbol" w:hAnsi="Symbol" w:hint="default"/>
+        <w:sz w:val="20"/>
+      </w:rPr>
+    </w:lvl>
+    <w:lvl w:ilvl="1" w:tentative="1">
+      <w:start w:val="1"/>
+      <w:numFmt w:val="bullet"/>
+      <w:lvlText w:val="o"/>
+      <w:lvlJc w:val="left"/>
+      <w:pPr>
+        <w:tabs>
+          <w:tab w:val="num" w:pos="1440"/>
+        </w:tabs>
+        <w:ind w:left="1440" w:hanging="360"/>
+      </w:pPr>
+      <w:rPr>
+        <w:rFonts w:ascii="Courier New" w:hAnsi="Courier New" w:hint="default"/>
+        <w:sz w:val="20"/>
+      </w:rPr>
+    </w:lvl>
+    <w:lvl w:ilvl="2" w:tentative="1">
+      <w:start w:val="1"/>
+      <w:numFmt w:val="bullet"/>
+      <w:lvlText w:val=""/>
+      <w:lvlJc w:val="left"/>
+      <w:pPr>
+        <w:tabs>
+          <w:tab w:val="num" w:pos="2160"/>
+        </w:tabs>
+        <w:ind w:left="2160" w:hanging="360"/>
+      </w:pPr>
+      <w:rPr>
+        <w:rFonts w:ascii="Wingdings" w:hAnsi="Wingdings" w:hint="default"/>
+        <w:sz w:val="20"/>
+      </w:rPr>
+    </w:lvl>
+    <w:lvl w:ilvl="3" w:tentative="1">
+      <w:start w:val="1"/>
+      <w:numFmt w:val="bullet"/>
+      <w:lvlText w:val=""/>
+      <w:lvlJc w:val="left"/>
+      <w:pPr>
+        <w:tabs>
+          <w:tab w:val="num" w:pos="2880"/>
+        </w:tabs>
+        <w:ind w:left="2880" w:hanging="360"/>
+      </w:pPr>
+      <w:rPr>
+        <w:rFonts w:ascii="Wingdings" w:hAnsi="Wingdings" w:hint="default"/>
+        <w:sz w:val="20"/>
+      </w:rPr>
+    </w:lvl>
+    <w:lvl w:ilvl="4" w:tentative="1">
+      <w:start w:val="1"/>
+      <w:numFmt w:val="bullet"/>
+      <w:lvlText w:val=""/>
+      <w:lvlJc w:val="left"/>
+      <w:pPr>
+        <w:tabs>
+          <w:tab w:val="num" w:pos="3600"/>
+        </w:tabs>
+        <w:ind w:left="3600" w:hanging="360"/>
+      </w:pPr>
+      <w:rPr>
+        <w:rFonts w:ascii="Wingdings" w:hAnsi="Wingdings" w:hint="default"/>
+        <w:sz w:val="20"/>
+      </w:rPr>
+    </w:lvl>
+    <w:lvl w:ilvl="5" w:tentative="1">
+      <w:start w:val="1"/>
+      <w:numFmt w:val="bullet"/>
+      <w:lvlText w:val=""/>
+      <w:lvlJc w:val="left"/>
+      <w:pPr>
+        <w:tabs>
+          <w:tab w:val="num" w:pos="4320"/>
+        </w:tabs>
+        <w:ind w:left="4320" w:hanging="360"/>
+      </w:pPr>
+      <w:rPr>
+        <w:rFonts w:ascii="Wingdings" w:hAnsi="Wingdings" w:hint="default"/>
+        <w:sz w:val="20"/>
+      </w:rPr>
+    </w:lvl>
+    <w:lvl w:ilvl="6" w:tentative="1">
+      <w:start w:val="1"/>
+      <w:numFmt w:val="bullet"/>
+      <w:lvlText w:val=""/>
+      <w:lvlJc w:val="left"/>
+      <w:pPr>
+        <w:tabs>
+          <w:tab w:val="num" w:pos="5040"/>
+        </w:tabs>
+        <w:ind w:left="5040" w:hanging="360"/>
+      </w:pPr>
+      <w:rPr>
+        <w:rFonts w:ascii="Wingdings" w:hAnsi="Wingdings" w:hint="default"/>
+        <w:sz w:val="20"/>
+      </w:rPr>
+    </w:lvl>
+    <w:lvl w:ilvl="7" w:tentative="1">
+      <w:start w:val="1"/>
+      <w:numFmt w:val="bullet"/>
+      <w:lvlText w:val=""/>
+      <w:lvlJc w:val="left"/>
+      <w:pPr>
+        <w:tabs>
+          <w:tab w:val="num" w:pos="5760"/>
+        </w:tabs>
+        <w:ind w:left="5760" w:hanging="360"/>
+      </w:pPr>
+      <w:rPr>
+        <w:rFonts w:ascii="Wingdings" w:hAnsi="Wingdings" w:hint="default"/>
+        <w:sz w:val="20"/>
+      </w:rPr>
+    </w:lvl>
+    <w:lvl w:ilvl="8" w:tentative="1">
+      <w:start w:val="1"/>
+      <w:numFmt w:val="bullet"/>
+      <w:lvlText w:val=""/>
+      <w:lvlJc w:val="left"/>
+      <w:pPr>
+        <w:tabs>
+          <w:tab w:val="num" w:pos="6480"/>
+        </w:tabs>
+        <w:ind w:left="6480" w:hanging="360"/>
+      </w:pPr>
+      <w:rPr>
+        <w:rFonts w:ascii="Wingdings" w:hAnsi="Wingdings" w:hint="default"/>
+        <w:sz w:val="20"/>
+      </w:rPr>
+    </w:lvl>
+  </w:abstractNum>
+  <w:num w:numId="1" w16cid:durableId="2002928548">
+    <w:abstractNumId w:val="1"/>
+  </w:num>
+  <w:num w:numId="2" w16cid:durableId="1380472994">
+    <w:abstractNumId w:val="0"/>
+  </w:num>
+</w:numbering>
+</file>
+
 <file path=word/styles.xml><?xml version="1.0" encoding="utf-8"?>
 <w:styles xmlns:mc="http://schemas.openxmlformats.org/markup-compatibility/2006" xmlns:r="http://schemas.openxmlformats.org/officeDocument/2006/relationships" xmlns:w="http://schemas.openxmlformats.org/wordprocessingml/2006/main" xmlns:w14="http://schemas.microsoft.com/office/word/2010/wordml" xmlns:w15="http://schemas.microsoft.com/office/word/2012/wordml" xmlns:w16cex="http://schemas.microsoft.com/office/word/2018/wordml/cex" xmlns:w16cid="http://schemas.microsoft.com/office/word/2016/wordml/cid" xmlns:w16="http://schemas.microsoft.com/office/word/2018/wordml" xmlns:w16du="http://schemas.microsoft.com/office/word/2023/wordml/word16du" xmlns:w16sdtdh="http://schemas.microsoft.com/office/word/2020/wordml/sdtdatahash" xmlns:w16sdtfl="http://schemas.microsoft.com/office/word/2024/wordml/sdtformatlock" xmlns:w16se="http://schemas.microsoft.com/office/word/2015/wordml/symex" mc:Ignorable="w14 w15 w16se w16cid w16 w16cex w16sdtdh w16sdtfl w16du">
   <w:docDefaults>
     <w:rPrDefault>
       <w:rPr>
-        <w:rFonts w:asciiTheme="minorHAnsi" w:eastAsiaTheme="minorEastAsia" w:hAnsiTheme="minorHAnsi" w:cstheme="minorBidi"/>
+        <w:rFonts w:asciiTheme="minorHAnsi" w:eastAsiaTheme="minorHAnsi" w:hAnsiTheme="minorHAnsi" w:cstheme="minorBidi"/>
         <w:kern w:val="2"/>
         <w:sz w:val="24"/>
         <w:szCs w:val="24"/>
-        <w:lang w:val="es-CR" w:eastAsia="ja-JP" w:bidi="ar-SA"/>
+        <w:lang w:val="en-US" w:eastAsia="en-US" w:bidi="ar-SA"/>
         <w14:ligatures w14:val="standardContextual"/>
       </w:rPr>
     </w:rPrDefault>
@@ -748,7 +1350,7 @@
     <w:link w:val="Ttulo1Car"/>
     <w:uiPriority w:val="9"/>
     <w:qFormat/>
-    <w:rsid w:val="00F93377"/>
+    <w:rsid w:val="001251DF"/>
     <w:pPr>
       <w:keepNext/>
       <w:keepLines/>
@@ -771,7 +1373,7 @@
     <w:semiHidden/>
     <w:unhideWhenUsed/>
     <w:qFormat/>
-    <w:rsid w:val="00F93377"/>
+    <w:rsid w:val="001251DF"/>
     <w:pPr>
       <w:keepNext/>
       <w:keepLines/>
@@ -794,7 +1396,7 @@
     <w:semiHidden/>
     <w:unhideWhenUsed/>
     <w:qFormat/>
-    <w:rsid w:val="00F93377"/>
+    <w:rsid w:val="001251DF"/>
     <w:pPr>
       <w:keepNext/>
       <w:keepLines/>
@@ -817,7 +1419,7 @@
     <w:semiHidden/>
     <w:unhideWhenUsed/>
     <w:qFormat/>
-    <w:rsid w:val="00F93377"/>
+    <w:rsid w:val="001251DF"/>
     <w:pPr>
       <w:keepNext/>
       <w:keepLines/>
@@ -840,7 +1442,7 @@
     <w:semiHidden/>
     <w:unhideWhenUsed/>
     <w:qFormat/>
-    <w:rsid w:val="00F93377"/>
+    <w:rsid w:val="001251DF"/>
     <w:pPr>
       <w:keepNext/>
       <w:keepLines/>
@@ -861,7 +1463,7 @@
     <w:semiHidden/>
     <w:unhideWhenUsed/>
     <w:qFormat/>
-    <w:rsid w:val="00F93377"/>
+    <w:rsid w:val="001251DF"/>
     <w:pPr>
       <w:keepNext/>
       <w:keepLines/>
@@ -884,7 +1486,7 @@
     <w:semiHidden/>
     <w:unhideWhenUsed/>
     <w:qFormat/>
-    <w:rsid w:val="00F93377"/>
+    <w:rsid w:val="001251DF"/>
     <w:pPr>
       <w:keepNext/>
       <w:keepLines/>
@@ -905,7 +1507,7 @@
     <w:semiHidden/>
     <w:unhideWhenUsed/>
     <w:qFormat/>
-    <w:rsid w:val="00F93377"/>
+    <w:rsid w:val="001251DF"/>
     <w:pPr>
       <w:keepNext/>
       <w:keepLines/>
@@ -928,7 +1530,7 @@
     <w:semiHidden/>
     <w:unhideWhenUsed/>
     <w:qFormat/>
-    <w:rsid w:val="00F93377"/>
+    <w:rsid w:val="001251DF"/>
     <w:pPr>
       <w:keepNext/>
       <w:keepLines/>
@@ -972,7 +1574,7 @@
     <w:basedOn w:val="Fuentedeprrafopredeter"/>
     <w:link w:val="Ttulo1"/>
     <w:uiPriority w:val="9"/>
-    <w:rsid w:val="00F93377"/>
+    <w:rsid w:val="001251DF"/>
     <w:rPr>
       <w:rFonts w:asciiTheme="majorHAnsi" w:eastAsiaTheme="majorEastAsia" w:hAnsiTheme="majorHAnsi" w:cstheme="majorBidi"/>
       <w:color w:val="0F4761" w:themeColor="accent1" w:themeShade="BF"/>
@@ -986,7 +1588,7 @@
     <w:link w:val="Ttulo2"/>
     <w:uiPriority w:val="9"/>
     <w:semiHidden/>
-    <w:rsid w:val="00F93377"/>
+    <w:rsid w:val="001251DF"/>
     <w:rPr>
       <w:rFonts w:asciiTheme="majorHAnsi" w:eastAsiaTheme="majorEastAsia" w:hAnsiTheme="majorHAnsi" w:cstheme="majorBidi"/>
       <w:color w:val="0F4761" w:themeColor="accent1" w:themeShade="BF"/>
@@ -1000,7 +1602,7 @@
     <w:link w:val="Ttulo3"/>
     <w:uiPriority w:val="9"/>
     <w:semiHidden/>
-    <w:rsid w:val="00F93377"/>
+    <w:rsid w:val="001251DF"/>
     <w:rPr>
       <w:rFonts w:eastAsiaTheme="majorEastAsia" w:cstheme="majorBidi"/>
       <w:color w:val="0F4761" w:themeColor="accent1" w:themeShade="BF"/>
@@ -1014,7 +1616,7 @@
     <w:link w:val="Ttulo4"/>
     <w:uiPriority w:val="9"/>
     <w:semiHidden/>
-    <w:rsid w:val="00F93377"/>
+    <w:rsid w:val="001251DF"/>
     <w:rPr>
       <w:rFonts w:eastAsiaTheme="majorEastAsia" w:cstheme="majorBidi"/>
       <w:i/>
@@ -1028,7 +1630,7 @@
     <w:link w:val="Ttulo5"/>
     <w:uiPriority w:val="9"/>
     <w:semiHidden/>
-    <w:rsid w:val="00F93377"/>
+    <w:rsid w:val="001251DF"/>
     <w:rPr>
       <w:rFonts w:eastAsiaTheme="majorEastAsia" w:cstheme="majorBidi"/>
       <w:color w:val="0F4761" w:themeColor="accent1" w:themeShade="BF"/>
@@ -1040,7 +1642,7 @@
     <w:link w:val="Ttulo6"/>
     <w:uiPriority w:val="9"/>
     <w:semiHidden/>
-    <w:rsid w:val="00F93377"/>
+    <w:rsid w:val="001251DF"/>
     <w:rPr>
       <w:rFonts w:eastAsiaTheme="majorEastAsia" w:cstheme="majorBidi"/>
       <w:i/>
@@ -1054,7 +1656,7 @@
     <w:link w:val="Ttulo7"/>
     <w:uiPriority w:val="9"/>
     <w:semiHidden/>
-    <w:rsid w:val="00F93377"/>
+    <w:rsid w:val="001251DF"/>
     <w:rPr>
       <w:rFonts w:eastAsiaTheme="majorEastAsia" w:cstheme="majorBidi"/>
       <w:color w:val="595959" w:themeColor="text1" w:themeTint="A6"/>
@@ -1066,7 +1668,7 @@
     <w:link w:val="Ttulo8"/>
     <w:uiPriority w:val="9"/>
     <w:semiHidden/>
-    <w:rsid w:val="00F93377"/>
+    <w:rsid w:val="001251DF"/>
     <w:rPr>
       <w:rFonts w:eastAsiaTheme="majorEastAsia" w:cstheme="majorBidi"/>
       <w:i/>
@@ -1080,7 +1682,7 @@
     <w:link w:val="Ttulo9"/>
     <w:uiPriority w:val="9"/>
     <w:semiHidden/>
-    <w:rsid w:val="00F93377"/>
+    <w:rsid w:val="001251DF"/>
     <w:rPr>
       <w:rFonts w:eastAsiaTheme="majorEastAsia" w:cstheme="majorBidi"/>
       <w:color w:val="272727" w:themeColor="text1" w:themeTint="D8"/>
@@ -1093,7 +1695,7 @@
     <w:link w:val="TtuloCar"/>
     <w:uiPriority w:val="10"/>
     <w:qFormat/>
-    <w:rsid w:val="00F93377"/>
+    <w:rsid w:val="001251DF"/>
     <w:pPr>
       <w:spacing w:after="80" w:line="240" w:lineRule="auto"/>
       <w:contextualSpacing/>
@@ -1111,7 +1713,7 @@
     <w:basedOn w:val="Fuentedeprrafopredeter"/>
     <w:link w:val="Ttulo"/>
     <w:uiPriority w:val="10"/>
-    <w:rsid w:val="00F93377"/>
+    <w:rsid w:val="001251DF"/>
     <w:rPr>
       <w:rFonts w:asciiTheme="majorHAnsi" w:eastAsiaTheme="majorEastAsia" w:hAnsiTheme="majorHAnsi" w:cstheme="majorBidi"/>
       <w:spacing w:val="-10"/>
@@ -1127,7 +1729,7 @@
     <w:link w:val="SubttuloCar"/>
     <w:uiPriority w:val="11"/>
     <w:qFormat/>
-    <w:rsid w:val="00F93377"/>
+    <w:rsid w:val="001251DF"/>
     <w:pPr>
       <w:numPr>
         <w:ilvl w:val="1"/>
@@ -1146,7 +1748,7 @@
     <w:basedOn w:val="Fuentedeprrafopredeter"/>
     <w:link w:val="Subttulo"/>
     <w:uiPriority w:val="11"/>
-    <w:rsid w:val="00F93377"/>
+    <w:rsid w:val="001251DF"/>
     <w:rPr>
       <w:rFonts w:eastAsiaTheme="majorEastAsia" w:cstheme="majorBidi"/>
       <w:color w:val="595959" w:themeColor="text1" w:themeTint="A6"/>
@@ -1162,7 +1764,7 @@
     <w:link w:val="CitaCar"/>
     <w:uiPriority w:val="29"/>
     <w:qFormat/>
-    <w:rsid w:val="00F93377"/>
+    <w:rsid w:val="001251DF"/>
     <w:pPr>
       <w:spacing w:before="160"/>
       <w:jc w:val="center"/>
@@ -1178,7 +1780,7 @@
     <w:basedOn w:val="Fuentedeprrafopredeter"/>
     <w:link w:val="Cita"/>
     <w:uiPriority w:val="29"/>
-    <w:rsid w:val="00F93377"/>
+    <w:rsid w:val="001251DF"/>
     <w:rPr>
       <w:i/>
       <w:iCs/>
@@ -1190,7 +1792,7 @@
     <w:basedOn w:val="Normal"/>
     <w:uiPriority w:val="34"/>
     <w:qFormat/>
-    <w:rsid w:val="00F93377"/>
+    <w:rsid w:val="001251DF"/>
     <w:pPr>
       <w:ind w:left="720"/>
       <w:contextualSpacing/>
@@ -1201,7 +1803,7 @@
     <w:basedOn w:val="Fuentedeprrafopredeter"/>
     <w:uiPriority w:val="21"/>
     <w:qFormat/>
-    <w:rsid w:val="00F93377"/>
+    <w:rsid w:val="001251DF"/>
     <w:rPr>
       <w:i/>
       <w:iCs/>
@@ -1215,7 +1817,7 @@
     <w:link w:val="CitadestacadaCar"/>
     <w:uiPriority w:val="30"/>
     <w:qFormat/>
-    <w:rsid w:val="00F93377"/>
+    <w:rsid w:val="001251DF"/>
     <w:pPr>
       <w:pBdr>
         <w:top w:val="single" w:sz="4" w:space="10" w:color="0F4761" w:themeColor="accent1" w:themeShade="BF"/>
@@ -1236,7 +1838,7 @@
     <w:basedOn w:val="Fuentedeprrafopredeter"/>
     <w:link w:val="Citadestacada"/>
     <w:uiPriority w:val="30"/>
-    <w:rsid w:val="00F93377"/>
+    <w:rsid w:val="001251DF"/>
     <w:rPr>
       <w:i/>
       <w:iCs/>
@@ -1248,7 +1850,7 @@
     <w:basedOn w:val="Fuentedeprrafopredeter"/>
     <w:uiPriority w:val="32"/>
     <w:qFormat/>
-    <w:rsid w:val="00F93377"/>
+    <w:rsid w:val="001251DF"/>
     <w:rPr>
       <w:b/>
       <w:bCs/>
@@ -1256,6 +1858,50 @@
       <w:color w:val="0F4761" w:themeColor="accent1" w:themeShade="BF"/>
       <w:spacing w:val="5"/>
     </w:rPr>
+  </w:style>
+  <w:style w:type="paragraph" w:styleId="Encabezado">
+    <w:name w:val="header"/>
+    <w:basedOn w:val="Normal"/>
+    <w:link w:val="EncabezadoCar"/>
+    <w:uiPriority w:val="99"/>
+    <w:unhideWhenUsed/>
+    <w:rsid w:val="000A67DE"/>
+    <w:pPr>
+      <w:tabs>
+        <w:tab w:val="center" w:pos="4680"/>
+        <w:tab w:val="right" w:pos="9360"/>
+      </w:tabs>
+      <w:spacing w:after="0" w:line="240" w:lineRule="auto"/>
+    </w:pPr>
+  </w:style>
+  <w:style w:type="character" w:customStyle="1" w:styleId="EncabezadoCar">
+    <w:name w:val="Encabezado Car"/>
+    <w:basedOn w:val="Fuentedeprrafopredeter"/>
+    <w:link w:val="Encabezado"/>
+    <w:uiPriority w:val="99"/>
+    <w:rsid w:val="000A67DE"/>
+  </w:style>
+  <w:style w:type="paragraph" w:styleId="Piedepgina">
+    <w:name w:val="footer"/>
+    <w:basedOn w:val="Normal"/>
+    <w:link w:val="PiedepginaCar"/>
+    <w:uiPriority w:val="99"/>
+    <w:unhideWhenUsed/>
+    <w:rsid w:val="000A67DE"/>
+    <w:pPr>
+      <w:tabs>
+        <w:tab w:val="center" w:pos="4680"/>
+        <w:tab w:val="right" w:pos="9360"/>
+      </w:tabs>
+      <w:spacing w:after="0" w:line="240" w:lineRule="auto"/>
+    </w:pPr>
+  </w:style>
+  <w:style w:type="character" w:customStyle="1" w:styleId="PiedepginaCar">
+    <w:name w:val="Pie de página Car"/>
+    <w:basedOn w:val="Fuentedeprrafopredeter"/>
+    <w:link w:val="Piedepgina"/>
+    <w:uiPriority w:val="99"/>
+    <w:rsid w:val="000A67DE"/>
   </w:style>
 </w:styles>
 </file>
@@ -1358,7 +2004,7 @@
         <a:latin typeface="Aptos" panose="02110004020202020204"/>
         <a:ea typeface=""/>
         <a:cs typeface=""/>
-        <a:font script="Jpan" typeface="游ゴシック"/>
+        <a:font script="Jpan" typeface="游明朝"/>
         <a:font script="Hang" typeface="맑은 고딕"/>
         <a:font script="Hans" typeface="等线"/>
         <a:font script="Hant" typeface="新細明體"/>
@@ -1549,7 +2195,7 @@
   <a:extraClrSchemeLst/>
   <a:extLst>
     <a:ext uri="{05A4C25C-085E-4340-85A3-A5531E510DB2}">
-      <thm15:themeFamily xmlns:thm15="http://schemas.microsoft.com/office/thememl/2012/main" name="Office Theme" id="{62F939B6-93AF-4DB8-9C6B-D6C7DFDC589F}" vid="{4A3C46E8-61CC-4603-A589-7422A47A8E4A}"/>
+      <thm15:themeFamily xmlns:thm15="http://schemas.microsoft.com/office/thememl/2012/main" name="Office Theme" id="{2E142A2C-CD16-42D6-873A-C26D2A0506FA}" vid="{1BDDFF52-6CD6-40A5-AB3C-68EB2F1E4D0A}"/>
     </a:ext>
   </a:extLst>
 </a:theme>

</xml_diff>

<commit_message>
Actualizacion de templates y como se carga la informacion
</commit_message>
<xml_diff>
--- a/templates/fcl_template.docx
+++ b/templates/fcl_template.docx
@@ -62,12 +62,11 @@
         </w:rPr>
         <w:br/>
       </w:r>
-      <w:proofErr w:type="gramStart"/>
-      <w:r>
-        <w:rPr>
-          <w:lang w:val="es-CR"/>
-        </w:rPr>
-        <w:t xml:space="preserve">Alajuela, </w:t>
+      <w:r>
+        <w:rPr>
+          <w:lang w:val="es-CR"/>
+        </w:rPr>
+        <w:t>Alajuela,</w:t>
       </w:r>
       <w:r>
         <w:rPr>
@@ -79,14 +78,7 @@
         <w:rPr>
           <w:lang w:val="es-CR"/>
         </w:rPr>
-        <w:t>{</w:t>
-      </w:r>
-      <w:proofErr w:type="gramEnd"/>
-      <w:r>
-        <w:rPr>
-          <w:lang w:val="es-CR"/>
-        </w:rPr>
-        <w:t>{fecha}}</w:t>
+        <w:t>{{fecha}}</w:t>
       </w:r>
     </w:p>
     <w:p>

</xml_diff>